<commit_message>
Fase 2: creación del main, y se colocó test.med (ejemplo del pdf del proyecto)
</commit_message>
<xml_diff>
--- a/PROYECTO 1/MANUAL TÉCNICO (Fase 1).docx
+++ b/PROYECTO 1/MANUAL TÉCNICO (Fase 1).docx
@@ -46,7 +46,31 @@
     </w:p>
     <w:p>
       <w:r>
-        <w:t>El presente documento describe el diseño del analizador léxico del proyecto MedLexer, el cual tiene como objetivo interpretar archivos con extensión .med escritos en el lenguaje MedLang, orientado a la gestión hospitalaria.</w:t>
+        <w:t xml:space="preserve">El presente documento describe el diseño del analizador léxico del proyecto </w:t>
+      </w:r>
+      <w:proofErr w:type="spellStart"/>
+      <w:r>
+        <w:t>MedLexer</w:t>
+      </w:r>
+      <w:proofErr w:type="spellEnd"/>
+      <w:r>
+        <w:t>, el cual tiene como objetivo interpretar archivos con extensión .</w:t>
+      </w:r>
+      <w:proofErr w:type="spellStart"/>
+      <w:r>
+        <w:t>med</w:t>
+      </w:r>
+      <w:proofErr w:type="spellEnd"/>
+      <w:r>
+        <w:t xml:space="preserve"> escritos en el lenguaje </w:t>
+      </w:r>
+      <w:proofErr w:type="spellStart"/>
+      <w:r>
+        <w:t>MedLang</w:t>
+      </w:r>
+      <w:proofErr w:type="spellEnd"/>
+      <w:r>
+        <w:t>, orientado a la gestión hospitalaria.</w:t>
       </w:r>
     </w:p>
     <w:p>
@@ -71,8 +95,17 @@
           <w:b/>
           <w:bCs/>
         </w:rPr>
-        <w:t>Definición del Lenguaje MedLang</w:t>
-      </w:r>
+        <w:t xml:space="preserve">Definición del Lenguaje </w:t>
+      </w:r>
+      <w:proofErr w:type="spellStart"/>
+      <w:r>
+        <w:rPr>
+          <w:b/>
+          <w:bCs/>
+        </w:rPr>
+        <w:t>MedLang</w:t>
+      </w:r>
+      <w:proofErr w:type="spellEnd"/>
     </w:p>
     <w:p>
       <w:pPr>
@@ -253,8 +286,13 @@
           <w:numId w:val="3"/>
         </w:numPr>
       </w:pPr>
-      <w:r>
-        <w:t xml:space="preserve">tipo_sangre </w:t>
+      <w:proofErr w:type="spellStart"/>
+      <w:r>
+        <w:t>tipo_sangre</w:t>
+      </w:r>
+      <w:proofErr w:type="spellEnd"/>
+      <w:r>
+        <w:t xml:space="preserve"> </w:t>
       </w:r>
     </w:p>
     <w:p>
@@ -264,8 +302,13 @@
           <w:numId w:val="3"/>
         </w:numPr>
       </w:pPr>
-      <w:r>
-        <w:t xml:space="preserve">habitacion </w:t>
+      <w:proofErr w:type="spellStart"/>
+      <w:r>
+        <w:t>habitacion</w:t>
+      </w:r>
+      <w:proofErr w:type="spellEnd"/>
+      <w:r>
+        <w:t xml:space="preserve"> </w:t>
       </w:r>
     </w:p>
     <w:p>
@@ -286,8 +329,13 @@
           <w:numId w:val="3"/>
         </w:numPr>
       </w:pPr>
-      <w:r>
-        <w:t xml:space="preserve">codigo </w:t>
+      <w:proofErr w:type="spellStart"/>
+      <w:r>
+        <w:t>codigo</w:t>
+      </w:r>
+      <w:proofErr w:type="spellEnd"/>
+      <w:r>
+        <w:t xml:space="preserve"> </w:t>
       </w:r>
     </w:p>
     <w:p>
@@ -319,8 +367,13 @@
           <w:numId w:val="3"/>
         </w:numPr>
       </w:pPr>
-      <w:r>
-        <w:t xml:space="preserve">condicion </w:t>
+      <w:proofErr w:type="spellStart"/>
+      <w:r>
+        <w:t>condicion</w:t>
+      </w:r>
+      <w:proofErr w:type="spellEnd"/>
+      <w:r>
+        <w:t xml:space="preserve"> </w:t>
       </w:r>
     </w:p>
     <w:p>
@@ -1067,8 +1120,23 @@
                 <w:lang w:eastAsia="es-ES"/>
                 <w14:ligatures w14:val="none"/>
               </w:rPr>
-              <w:t>Nuestro next</w:t>
-            </w:r>
+              <w:t xml:space="preserve">Nuestro </w:t>
+            </w:r>
+            <w:proofErr w:type="spellStart"/>
+            <w:r>
+              <w:rPr>
+                <w:rFonts w:eastAsia="Times New Roman" w:cs="Times New Roman"/>
+                <w:b/>
+                <w:bCs/>
+                <w:kern w:val="0"/>
+                <w:sz w:val="24"/>
+                <w:szCs w:val="24"/>
+                <w:lang w:eastAsia="es-ES"/>
+                <w14:ligatures w14:val="none"/>
+              </w:rPr>
+              <w:t>next</w:t>
+            </w:r>
+            <w:proofErr w:type="spellEnd"/>
           </w:p>
         </w:tc>
         <w:tc>
@@ -1414,17 +1482,43 @@
                 <w14:ligatures w14:val="none"/>
               </w:rPr>
             </w:pPr>
-            <w:r>
-              <w:rPr>
-                <w:rFonts w:eastAsia="Times New Roman" w:cs="Times New Roman"/>
-                <w:kern w:val="0"/>
-                <w:sz w:val="24"/>
-                <w:szCs w:val="24"/>
-                <w:lang w:eastAsia="es-ES"/>
-                <w14:ligatures w14:val="none"/>
-              </w:rPr>
-              <w:t>start string</w:t>
-            </w:r>
+            <w:proofErr w:type="spellStart"/>
+            <w:r>
+              <w:rPr>
+                <w:rFonts w:eastAsia="Times New Roman" w:cs="Times New Roman"/>
+                <w:kern w:val="0"/>
+                <w:sz w:val="24"/>
+                <w:szCs w:val="24"/>
+                <w:lang w:eastAsia="es-ES"/>
+                <w14:ligatures w14:val="none"/>
+              </w:rPr>
+              <w:t>start</w:t>
+            </w:r>
+            <w:proofErr w:type="spellEnd"/>
+            <w:r>
+              <w:rPr>
+                <w:rFonts w:eastAsia="Times New Roman" w:cs="Times New Roman"/>
+                <w:kern w:val="0"/>
+                <w:sz w:val="24"/>
+                <w:szCs w:val="24"/>
+                <w:lang w:eastAsia="es-ES"/>
+                <w14:ligatures w14:val="none"/>
+              </w:rPr>
+              <w:t xml:space="preserve"> </w:t>
+            </w:r>
+            <w:proofErr w:type="spellStart"/>
+            <w:r>
+              <w:rPr>
+                <w:rFonts w:eastAsia="Times New Roman" w:cs="Times New Roman"/>
+                <w:kern w:val="0"/>
+                <w:sz w:val="24"/>
+                <w:szCs w:val="24"/>
+                <w:lang w:eastAsia="es-ES"/>
+                <w14:ligatures w14:val="none"/>
+              </w:rPr>
+              <w:t>string</w:t>
+            </w:r>
+            <w:proofErr w:type="spellEnd"/>
           </w:p>
         </w:tc>
       </w:tr>
@@ -1580,7 +1674,31 @@
                 <w:lang w:eastAsia="es-ES"/>
                 <w14:ligatures w14:val="none"/>
               </w:rPr>
-              <w:t>posible keyword/código</w:t>
+              <w:t xml:space="preserve">posible </w:t>
+            </w:r>
+            <w:proofErr w:type="spellStart"/>
+            <w:r>
+              <w:rPr>
+                <w:rFonts w:eastAsia="Times New Roman" w:cs="Times New Roman"/>
+                <w:kern w:val="0"/>
+                <w:sz w:val="24"/>
+                <w:szCs w:val="24"/>
+                <w:lang w:eastAsia="es-ES"/>
+                <w14:ligatures w14:val="none"/>
+              </w:rPr>
+              <w:t>keyword</w:t>
+            </w:r>
+            <w:proofErr w:type="spellEnd"/>
+            <w:r>
+              <w:rPr>
+                <w:rFonts w:eastAsia="Times New Roman" w:cs="Times New Roman"/>
+                <w:kern w:val="0"/>
+                <w:sz w:val="24"/>
+                <w:szCs w:val="24"/>
+                <w:lang w:eastAsia="es-ES"/>
+                <w14:ligatures w14:val="none"/>
+              </w:rPr>
+              <w:t>/código</w:t>
             </w:r>
           </w:p>
         </w:tc>
@@ -1728,6 +1846,7 @@
                 <w14:ligatures w14:val="none"/>
               </w:rPr>
             </w:pPr>
+            <w:proofErr w:type="spellStart"/>
             <w:r>
               <w:rPr>
                 <w:rFonts w:eastAsia="Times New Roman" w:cs="Times New Roman"/>
@@ -1739,6 +1858,7 @@
               </w:rPr>
               <w:t>ident</w:t>
             </w:r>
+            <w:proofErr w:type="spellEnd"/>
           </w:p>
         </w:tc>
       </w:tr>
@@ -1885,6 +2005,7 @@
                 <w14:ligatures w14:val="none"/>
               </w:rPr>
             </w:pPr>
+            <w:proofErr w:type="spellStart"/>
             <w:r>
               <w:rPr>
                 <w:rFonts w:eastAsia="Times New Roman" w:cs="Times New Roman"/>
@@ -1896,6 +2017,7 @@
               </w:rPr>
               <w:t>number</w:t>
             </w:r>
+            <w:proofErr w:type="spellEnd"/>
           </w:p>
         </w:tc>
       </w:tr>
@@ -2123,6 +2245,7 @@
                 <w14:ligatures w14:val="none"/>
               </w:rPr>
             </w:pPr>
+            <w:proofErr w:type="spellStart"/>
             <w:r>
               <w:rPr>
                 <w:rFonts w:eastAsia="Times New Roman" w:cs="Times New Roman"/>
@@ -2135,6 +2258,7 @@
               </w:rPr>
               <w:t>else</w:t>
             </w:r>
+            <w:proofErr w:type="spellEnd"/>
           </w:p>
         </w:tc>
         <w:tc>
@@ -2677,7 +2801,31 @@
                 <w:lang w:eastAsia="es-ES"/>
                 <w14:ligatures w14:val="none"/>
               </w:rPr>
-              <w:t>evalúa palabra reservada/enum/ID</w:t>
+              <w:t>evalúa palabra reservada/</w:t>
+            </w:r>
+            <w:proofErr w:type="spellStart"/>
+            <w:r>
+              <w:rPr>
+                <w:rFonts w:eastAsia="Times New Roman" w:cs="Times New Roman"/>
+                <w:kern w:val="0"/>
+                <w:sz w:val="24"/>
+                <w:szCs w:val="24"/>
+                <w:lang w:eastAsia="es-ES"/>
+                <w14:ligatures w14:val="none"/>
+              </w:rPr>
+              <w:t>enum</w:t>
+            </w:r>
+            <w:proofErr w:type="spellEnd"/>
+            <w:r>
+              <w:rPr>
+                <w:rFonts w:eastAsia="Times New Roman" w:cs="Times New Roman"/>
+                <w:kern w:val="0"/>
+                <w:sz w:val="24"/>
+                <w:szCs w:val="24"/>
+                <w:lang w:eastAsia="es-ES"/>
+                <w14:ligatures w14:val="none"/>
+              </w:rPr>
+              <w:t>/ID</w:t>
             </w:r>
           </w:p>
         </w:tc>
@@ -2982,16 +3130,29 @@
                 <w14:ligatures w14:val="none"/>
               </w:rPr>
             </w:pPr>
-            <w:r>
-              <w:rPr>
-                <w:rFonts w:eastAsia="Times New Roman" w:cs="Times New Roman"/>
-                <w:kern w:val="0"/>
-                <w:sz w:val="24"/>
-                <w:szCs w:val="24"/>
-                <w:lang w:eastAsia="es-ES"/>
-                <w14:ligatures w14:val="none"/>
-              </w:rPr>
-              <w:t>string válida</w:t>
+            <w:proofErr w:type="spellStart"/>
+            <w:r>
+              <w:rPr>
+                <w:rFonts w:eastAsia="Times New Roman" w:cs="Times New Roman"/>
+                <w:kern w:val="0"/>
+                <w:sz w:val="24"/>
+                <w:szCs w:val="24"/>
+                <w:lang w:eastAsia="es-ES"/>
+                <w14:ligatures w14:val="none"/>
+              </w:rPr>
+              <w:t>string</w:t>
+            </w:r>
+            <w:proofErr w:type="spellEnd"/>
+            <w:r>
+              <w:rPr>
+                <w:rFonts w:eastAsia="Times New Roman" w:cs="Times New Roman"/>
+                <w:kern w:val="0"/>
+                <w:sz w:val="24"/>
+                <w:szCs w:val="24"/>
+                <w:lang w:eastAsia="es-ES"/>
+                <w14:ligatures w14:val="none"/>
+              </w:rPr>
+              <w:t xml:space="preserve"> válida</w:t>
             </w:r>
           </w:p>
         </w:tc>
@@ -4832,7 +4993,31 @@
                 <w:lang w:eastAsia="es-ES"/>
                 <w14:ligatures w14:val="none"/>
               </w:rPr>
-              <w:t>S0 (reset)</w:t>
+              <w:t>S0 (</w:t>
+            </w:r>
+            <w:proofErr w:type="spellStart"/>
+            <w:r>
+              <w:rPr>
+                <w:rFonts w:eastAsia="Times New Roman" w:cs="Times New Roman"/>
+                <w:kern w:val="0"/>
+                <w:sz w:val="24"/>
+                <w:szCs w:val="24"/>
+                <w:lang w:eastAsia="es-ES"/>
+                <w14:ligatures w14:val="none"/>
+              </w:rPr>
+              <w:t>reset</w:t>
+            </w:r>
+            <w:proofErr w:type="spellEnd"/>
+            <w:r>
+              <w:rPr>
+                <w:rFonts w:eastAsia="Times New Roman" w:cs="Times New Roman"/>
+                <w:kern w:val="0"/>
+                <w:sz w:val="24"/>
+                <w:szCs w:val="24"/>
+                <w:lang w:eastAsia="es-ES"/>
+                <w14:ligatures w14:val="none"/>
+              </w:rPr>
+              <w:t>)</w:t>
             </w:r>
           </w:p>
         </w:tc>
@@ -5027,7 +5212,15 @@
         </w:numPr>
       </w:pPr>
       <w:r>
-        <w:t>S1 = reconocimiento de palabra ([A-Za-z_])</w:t>
+        <w:t>S1 = reconocimiento de palabra ([A-</w:t>
+      </w:r>
+      <w:proofErr w:type="spellStart"/>
+      <w:r>
+        <w:t>Za</w:t>
+      </w:r>
+      <w:proofErr w:type="spellEnd"/>
+      <w:r>
+        <w:t>-z_])</w:t>
       </w:r>
     </w:p>
     <w:p>
@@ -5060,7 +5253,15 @@
         </w:numPr>
       </w:pPr>
       <w:r>
-        <w:t>S4 = fechas parcial (aaaa-)</w:t>
+        <w:t>S4 = fechas parcial (</w:t>
+      </w:r>
+      <w:proofErr w:type="spellStart"/>
+      <w:r>
+        <w:t>aaaa</w:t>
+      </w:r>
+      <w:proofErr w:type="spellEnd"/>
+      <w:r>
+        <w:t>-)</w:t>
       </w:r>
     </w:p>
     <w:p>
@@ -5071,7 +5272,15 @@
         </w:numPr>
       </w:pPr>
       <w:r>
-        <w:t>S5 = horas parcial (hh:)</w:t>
+        <w:t>S5 = horas parcial (</w:t>
+      </w:r>
+      <w:proofErr w:type="spellStart"/>
+      <w:r>
+        <w:t>hh</w:t>
+      </w:r>
+      <w:proofErr w:type="spellEnd"/>
+      <w:r>
+        <w:t>:)</w:t>
       </w:r>
     </w:p>
     <w:p>
@@ -5082,7 +5291,15 @@
         </w:numPr>
       </w:pPr>
       <w:r>
-        <w:t>S6 = códigos con guión (X)</w:t>
+        <w:t xml:space="preserve">S6 = códigos con </w:t>
+      </w:r>
+      <w:proofErr w:type="spellStart"/>
+      <w:r>
+        <w:t>guión</w:t>
+      </w:r>
+      <w:proofErr w:type="spellEnd"/>
+      <w:r>
+        <w:t xml:space="preserve"> (X)</w:t>
       </w:r>
     </w:p>
     <w:p>
@@ -5163,7 +5380,15 @@
         </w:numPr>
       </w:pPr>
       <w:r>
-        <w:t>[A-Z] → S1 (posible keyword / enumerado / código)</w:t>
+        <w:t xml:space="preserve">[A-Z] → S1 (posible </w:t>
+      </w:r>
+      <w:proofErr w:type="spellStart"/>
+      <w:r>
+        <w:t>keyword</w:t>
+      </w:r>
+      <w:proofErr w:type="spellEnd"/>
+      <w:r>
+        <w:t xml:space="preserve"> / enumerado / código)</w:t>
       </w:r>
     </w:p>
     <w:p>
@@ -5196,10 +5421,7 @@
         </w:numPr>
       </w:pPr>
       <w:r>
-        <w:t>{ } [ ] : , → SF_DELIM</w:t>
-      </w:r>
-      <w:r>
-        <w:t xml:space="preserve"> </w:t>
+        <w:t xml:space="preserve">{ } [ ] : , → SF_DELIM </w:t>
       </w:r>
     </w:p>
     <w:p>
@@ -5221,7 +5443,15 @@
         </w:numPr>
       </w:pPr>
       <w:r>
-        <w:t>WS → S0 (skip)</w:t>
+        <w:t>WS → S0 (</w:t>
+      </w:r>
+      <w:proofErr w:type="spellStart"/>
+      <w:r>
+        <w:t>skip</w:t>
+      </w:r>
+      <w:proofErr w:type="spellEnd"/>
+      <w:r>
+        <w:t>)</w:t>
       </w:r>
     </w:p>
     <w:p>
@@ -5266,7 +5496,15 @@
         </w:numPr>
       </w:pPr>
       <w:r>
-        <w:t>otro → aceptación token (palabra/reservada/enum/identificador), retroceso 1</w:t>
+        <w:t>otro → aceptación token (palabra/reservada/</w:t>
+      </w:r>
+      <w:proofErr w:type="spellStart"/>
+      <w:r>
+        <w:t>enum</w:t>
+      </w:r>
+      <w:proofErr w:type="spellEnd"/>
+      <w:r>
+        <w:t>/identificador), retroceso 1</w:t>
       </w:r>
     </w:p>
     <w:p>
@@ -5290,8 +5528,13 @@
         </w:numPr>
       </w:pPr>
       <w:r>
-        <w:t>" → aceptación string</w:t>
-      </w:r>
+        <w:t xml:space="preserve">" → aceptación </w:t>
+      </w:r>
+      <w:proofErr w:type="spellStart"/>
+      <w:r>
+        <w:t>string</w:t>
+      </w:r>
+      <w:proofErr w:type="spellEnd"/>
     </w:p>
     <w:p>
       <w:pPr>
@@ -5436,10 +5679,7 @@
         </w:numPr>
       </w:pPr>
       <w:r>
-        <w:t>[0-5][0-9] → aceptación hora</w:t>
-      </w:r>
-      <w:r>
-        <w:t xml:space="preserve"> </w:t>
+        <w:t xml:space="preserve">[0-5][0-9] → aceptación hora </w:t>
       </w:r>
     </w:p>
     <w:p>
@@ -6500,7 +6740,15 @@
               <w:jc w:val="center"/>
             </w:pPr>
             <w:r>
-              <w:t>hora: 30:90, tipo_sangre: "X+"</w:t>
+              <w:t xml:space="preserve">hora: 30:90, </w:t>
+            </w:r>
+            <w:proofErr w:type="spellStart"/>
+            <w:r>
+              <w:t>tipo_sangre</w:t>
+            </w:r>
+            <w:proofErr w:type="spellEnd"/>
+            <w:r>
+              <w:t>: "X+"</w:t>
             </w:r>
           </w:p>
         </w:tc>
@@ -6628,7 +6876,15 @@
               <w:jc w:val="center"/>
             </w:pPr>
             <w:r>
-              <w:t>(empty)</w:t>
+              <w:t>(</w:t>
+            </w:r>
+            <w:proofErr w:type="spellStart"/>
+            <w:r>
+              <w:t>empty</w:t>
+            </w:r>
+            <w:proofErr w:type="spellEnd"/>
+            <w:r>
+              <w:t>)</w:t>
             </w:r>
           </w:p>
         </w:tc>
@@ -6738,7 +6994,14 @@
           <w:b/>
           <w:bCs/>
         </w:rPr>
-        <w:t>Continuacion de la fase 2-4</w:t>
+        <w:t>continuación</w:t>
+      </w:r>
+      <w:r>
+        <w:rPr>
+          <w:b/>
+          <w:bCs/>
+        </w:rPr>
+        <w:t xml:space="preserve"> de la fase 2-4</w:t>
       </w:r>
     </w:p>
     <w:p>
@@ -10499,6 +10762,7 @@
   <w:style w:type="character" w:default="1" w:styleId="Fuentedeprrafopredeter">
     <w:name w:val="Default Paragraph Font"/>
     <w:uiPriority w:val="1"/>
+    <w:semiHidden/>
     <w:unhideWhenUsed/>
   </w:style>
   <w:style w:type="table" w:default="1" w:styleId="Tablanormal">

</xml_diff>